<commit_message>
Added Oracle PDB (Adventureworks2025) provisioning with SYSDBA support. Enforced override/recreate of target objects on new runs. Implemented full dependent-object migration: PK/UQ/indexes, defaults, sequences, views/procs/functions/triggers/synonyms, and post-load foreign keys (ENABLE NOVALIDATE). Upgraded ToolMig tracking to include ObjectType; updated requirements docs.
</commit_message>
<xml_diff>
--- a/Docs/SqlToOracleMigrator_FutureEnhancements_Requirements_v1.docx
+++ b/Docs/SqlToOracleMigrator_FutureEnhancements_Requirements_v1.docx
@@ -545,6 +545,107 @@
         <w:t>Where to store override files and run artifacts (repo vs centralized storage).</w:t>
       </w:r>
     </w:p>
+    <w:p>
+      <w:r>
+        <w:br w:type="page"/>
+      </w:r>
+    </w:p>
+    <w:p>
+      <w:pPr>
+        <w:pStyle w:val="Heading1"/>
+      </w:pPr>
+      <w:r>
+        <w:t>2026-01 Updates Implemented</w:t>
+      </w:r>
+    </w:p>
+    <w:p>
+      <w:pPr>
+        <w:pStyle w:val="Heading2"/>
+      </w:pPr>
+      <w:r>
+        <w:t>Global Requirements</w:t>
+      </w:r>
+    </w:p>
+    <w:p>
+      <w:pPr>
+        <w:pStyle w:val="ListParagraph"/>
+      </w:pPr>
+      <w:r>
+        <w:t>• Override target definitions and data on every NEW run (non-resume): drop and recreate objects and reload data using the latest state in the target system.</w:t>
+      </w:r>
+    </w:p>
+    <w:p>
+      <w:pPr>
+        <w:pStyle w:val="ListParagraph"/>
+      </w:pPr>
+      <w:r>
+        <w:t>• Migrate dependent objects (constraints, indexes, foreign keys, views, procedures, functions, triggers, synonyms, and sequences) as a first-class requirement.</w:t>
+      </w:r>
+    </w:p>
+    <w:p>
+      <w:pPr>
+        <w:pStyle w:val="Heading2"/>
+      </w:pPr>
+      <w:r>
+        <w:t>Enhancements</w:t>
+      </w:r>
+    </w:p>
+    <w:p>
+      <w:pPr>
+        <w:pStyle w:val="ListParagraph"/>
+      </w:pPr>
+      <w:r>
+        <w:t>• Oracle PDB support: ensure and switch to a target pluggable database named Adventureworks2025 when connected as SYSDBA (multitenant required).</w:t>
+      </w:r>
+    </w:p>
+    <w:p>
+      <w:pPr>
+        <w:pStyle w:val="ListParagraph"/>
+      </w:pPr>
+      <w:r>
+        <w:t>• Target schema reset now applies to single-schema mode as well (not only CloneSchemas) when OverrideTargetObjectsEachRun is enabled and the run is not a resume.</w:t>
+      </w:r>
+    </w:p>
+    <w:p>
+      <w:pPr>
+        <w:pStyle w:val="ListParagraph"/>
+      </w:pPr>
+      <w:r>
+        <w:t>• Track completion per object type (TABLE/VIEW/PROCEDURE/...) so DDL for non-table objects can be resumed reliably.</w:t>
+      </w:r>
+    </w:p>
+    <w:p>
+      <w:pPr>
+        <w:pStyle w:val="Heading2"/>
+      </w:pPr>
+      <w:r>
+        <w:t>Issues Addressed</w:t>
+      </w:r>
+    </w:p>
+    <w:p>
+      <w:pPr>
+        <w:pStyle w:val="ListParagraph"/>
+      </w:pPr>
+      <w:r>
+        <w:t>• Primary and unique constraints, and non-constraint indexes are now created in the target after each table is created (e.g., PK_Department_DepartmentID, AK_Department_Name).</w:t>
+      </w:r>
+    </w:p>
+    <w:p>
+      <w:pPr>
+        <w:pStyle w:val="ListParagraph"/>
+      </w:pPr>
+      <w:r>
+        <w:t>• Foreign keys are deployed after data migration (ENABLE NOVALIDATE by default) to prevent load failures while ensuring constraints exist.</w:t>
+      </w:r>
+    </w:p>
+    <w:p>
+      <w:pPr>
+        <w:pStyle w:val="ListParagraph"/>
+      </w:pPr>
+      <w:r>
+        <w:t>• Views, procedures, functions, triggers, synonyms, user-defined types, and sequences are now created in the target system. Where automated translation is not possible, the tool creates compilable stubs and preserves the source SQL definition for manual refinement.</w:t>
+      </w:r>
+    </w:p>
     <w:sectPr>
       <w:pgSz w:w="12240" w:h="15840"/>
       <w:pgMar w:top="1440" w:right="1800" w:bottom="1440" w:left="1800" w:header="720" w:footer="720" w:gutter="0"/>

</xml_diff>

<commit_message>
Restored both toolbar actions: Create Target PDB and Validate Migration. Enhanced Create PDB flow to allow editing/admin override of Oracle username (pre-populated from saved connection), SYSDBA toggle, and password prompt to create/drop PDBs. Validation UI remains available and uses recent connections for post-migration verification and reporting.
</commit_message>
<xml_diff>
--- a/Docs/SqlToOracleMigrator_FutureEnhancements_Requirements_v1.docx
+++ b/Docs/SqlToOracleMigrator_FutureEnhancements_Requirements_v1.docx
@@ -646,6 +646,49 @@
         <w:t>• Views, procedures, functions, triggers, synonyms, user-defined types, and sequences are now created in the target system. Where automated translation is not possible, the tool creates compilable stubs and preserves the source SQL definition for manual refinement.</w:t>
       </w:r>
     </w:p>
+    <w:p>
+      <w:r>
+        <w:br w:type="page"/>
+      </w:r>
+    </w:p>
+    <w:p>
+      <w:pPr>
+        <w:pStyle w:val="Heading1"/>
+      </w:pPr>
+      <w:r>
+        <w:t>January 2026 Enhancements: Post-Migration Validation &amp; Completion Criteria</w:t>
+      </w:r>
+    </w:p>
+    <w:p>
+      <w:r>
+        <w:t>• Global requirement: each run must use the latest state from the target system (override/refresh target inventory and definitions before deploying).</w:t>
+      </w:r>
+    </w:p>
+    <w:p>
+      <w:r>
+        <w:t>• Migration completion criteria: mark a run as Completed only when all required object types are created in the target (tables, constraints/PK/FK, indexes, views, procedures, functions, triggers, synonyms, sequences, and user-defined types where applicable).</w:t>
+      </w:r>
+    </w:p>
+    <w:p>
+      <w:r>
+        <w:t>• If any object cannot be created automatically (e.g., unsupported SQL Server feature), the tool must record it explicitly as Not Migrated or Stubbed and surface it in the UI and reports; do not silently skip.</w:t>
+      </w:r>
+    </w:p>
+    <w:p>
+      <w:r>
+        <w:t>• Add a Post-Migration Validation module (user-invoked) to compare SQL Server vs Oracle for: object existence, invalid objects, key presence, and row counts (optional).</w:t>
+      </w:r>
+    </w:p>
+    <w:p>
+      <w:r>
+        <w:t>• Validation UI: accessible via a button next to Create PDB; allows selecting recent SQL and Oracle connections, specifying source DB and schemas, and running validation.</w:t>
+      </w:r>
+    </w:p>
+    <w:p>
+      <w:r>
+        <w:t>• Validation report: generate JSON and HTML files with totals by object type, per-table row counts, and pass/fail results (missing objects, invalid objects, key mismatches).</w:t>
+      </w:r>
+    </w:p>
     <w:sectPr>
       <w:pgSz w:w="12240" w:h="15840"/>
       <w:pgMar w:top="1440" w:right="1800" w:bottom="1440" w:left="1800" w:header="720" w:footer="720" w:gutter="0"/>

</xml_diff>

<commit_message>
Fixed Oracle inventory compilation and robustness: removed invalid `OracleConnection.UserId` usage, deduped `ListObjectsPagedAsync`, aligned `InventoryObjectSummary` property names, added safer current schema lookup, and stabilized object listing used by Combined Inventory + Post-Migration Validation DB/schema auto-population and drill-down.
</commit_message>
<xml_diff>
--- a/Docs/SqlToOracleMigrator_FutureEnhancements_Requirements_v1.docx
+++ b/Docs/SqlToOracleMigrator_FutureEnhancements_Requirements_v1.docx
@@ -689,6 +689,63 @@
         <w:t>• Validation report: generate JSON and HTML files with totals by object type, per-table row counts, and pass/fail results (missing objects, invalid objects, key mismatches).</w:t>
       </w:r>
     </w:p>
+    <w:p/>
+    <w:p>
+      <w:pPr>
+        <w:pStyle w:val="Heading2"/>
+      </w:pPr>
+      <w:r>
+        <w:t>Recent Updates (2026-02-02)</w:t>
+      </w:r>
+    </w:p>
+    <w:p>
+      <w:pPr>
+        <w:pStyle w:val="ListBullet"/>
+      </w:pPr>
+      <w:r>
+        <w:t>Post-Migration Validation: Source Database dropdown auto-populates from the selected SQL connection (sys.databases) and refreshes on demand.</w:t>
+      </w:r>
+    </w:p>
+    <w:p>
+      <w:pPr>
+        <w:pStyle w:val="ListBullet"/>
+      </w:pPr>
+      <w:r>
+        <w:t>Post-Migration Validation: Schemas auto-load for the selected Source Database (sys.schemas) and are selected by default; Select All/None provided.</w:t>
+      </w:r>
+    </w:p>
+    <w:p>
+      <w:pPr>
+        <w:pStyle w:val="ListBullet"/>
+      </w:pPr>
+      <w:r>
+        <w:t>Validation execution now prefers active connections (no re-prompt when already connected) and uses the selected Source Database for report generation.</w:t>
+      </w:r>
+    </w:p>
+    <w:p>
+      <w:pPr>
+        <w:pStyle w:val="ListBullet"/>
+      </w:pPr>
+      <w:r>
+        <w:t>Open Last Report now launches the latest JSON report file using the system default viewer.</w:t>
+      </w:r>
+    </w:p>
+    <w:p>
+      <w:pPr>
+        <w:pStyle w:val="ListBullet"/>
+      </w:pPr>
+      <w:r>
+        <w:t>Combined Inventory (read-only): Object drill-down works for both SQL and Oracle; objects are sorted by Type then Name for easier grouping.</w:t>
+      </w:r>
+    </w:p>
+    <w:p>
+      <w:pPr>
+        <w:pStyle w:val="ListBullet"/>
+      </w:pPr>
+      <w:r>
+        <w:t>Connections tree double-click loads inventory and auto-expands the most relevant inventory row so object details are immediately visible.</w:t>
+      </w:r>
+    </w:p>
     <w:sectPr>
       <w:pgSz w:w="12240" w:h="15840"/>
       <w:pgMar w:top="1440" w:right="1800" w:bottom="1440" w:left="1800" w:header="720" w:footer="720" w:gutter="0"/>

</xml_diff>